<commit_message>
docs(research): purge em-dashes, embed all figures, breakdown math formulas, and synchronize RQ1-RQ4 across all docs
</commit_message>
<xml_diff>
--- a/research/technical_report.docx
+++ b/research/technical_report.docx
@@ -110,11 +110,21 @@
         <w:jc w:val="both"/>
       </w:pPr>
       <w:r>
-        <w:rPr>
-          <w:rFonts w:ascii="Times New Roman" w:hAnsi="Times New Roman"/>
-          <w:sz w:val="24"/>
-        </w:rPr>
         <w:t>This technical report details the architecture, implementation, and deployment of a three-tier intrusion detection framework combining Binary Whale Optimization (BWOA) with a spatial-temporal CNN-LSTM neural network. By pruning network telemetry from 41 features to 10 (75.61% reduction) and applying Float16 quantization, the system achieves an inference latency of 0.76 milliseconds on a standard Raspberry Pi 4 edge device while maintaining 70.56% multi-class accuracy and 96.89% precision on benign flows. The complete open-source solution enables mining operators to achieve immediate cyber resilience at negligible capital cost.</w:t>
+        <w:br/>
+        <w:br/>
+        <w:t>1.3 Formal Research Questions</w:t>
+        <w:br/>
+        <w:t>To establish rigorous empirical grounding under the Design Science Research methodology, the technical investigation addresses four core research questions:</w:t>
+        <w:br/>
+        <w:br/>
+        <w:t>- RQ1 (Dimensionality Optimization): To what extent can a constrained Binary Whale Optimization Algorithm (BWOA) with an adaptive alpha decay schedule and a hard accuracy floor prune high-dimensional industrial telemetry features while preserving multi-class threat discrimination?</w:t>
+        <w:br/>
+        <w:t>- RQ2 (Spatial-Temporal Threat Modeling): How effectively does a hybrid 1D Convolutional Neural Network and Long Short-Term Memory (Conv1D-LSTM) architecture capture packet-level spatial correlations and sequential connection state transitions in industrial SCADA networks?</w:t>
+        <w:br/>
+        <w:t>- RQ3 (Edge Real-Time Execution and Quantization): Can post-training Float16 quantization compress the spatial-temporal neural network below 1.0 MB and achieve sub-millisecond (&lt;1.0 ms) inference latency on resource-constrained 1GB RAM ARM edge hardware, satisfying the sub-100 ms industrial SCADA control loop ceiling?</w:t>
+        <w:br/>
+        <w:t>- RQ4 (Empirical Generalization, Transferability, and Economic Impact): How robustly does the framework generalize across physical industrial SCADA testbeds (such as the 51-sensor SWaT testbed), and what is its operational and economic return on investment (ROI) in mitigating industrial downtime and preserving human life in mineral extraction operations?</w:t>
       </w:r>
     </w:p>
     <w:p>

</xml_diff>